<commit_message>
Add Martabe WIs batch 8 (density gauge, lime slaker, hydrated lime, acid wash, carbon launder)
Co-Authored-By: Claude Sonnet 5.5 <noreply@anthropic.com>
Claude-Session: https://claude.ai/code/session_0121qocWgsZdFAsne2oz9sHT
</commit_message>
<xml_diff>
--- a/SWI/201-Plant-Sampling/MM-4034-033-OR-03-SWI-PRO-MET-201-004-CIL-Sampling-Round---032-TK-002-to-032-TK-006-Launders-RevA.docx
+++ b/SWI/201-Plant-Sampling/MM-4034-033-OR-03-SWI-PRO-MET-201-004-CIL-Sampling-Round---032-TK-002-to-032-TK-006-Launders-RevA.docx
@@ -602,6 +602,60 @@
       <w:pPr>
         <w:spacing w:after="100" w:before="0" w:line="245"/>
       </w:pPr>
+    </w:p>
+    <w:tbl>
+      <w:tblPr>
+        <w:tblW w:type="dxa" w:w="9026"/>
+        <w:tblBorders>
+          <w:left w:val="single" w:color="B7791F" w:sz="18"/>
+        </w:tblBorders>
+        <w:tblCellMar>
+          <w:top w:type="dxa" w:w="90"/>
+          <w:left w:type="dxa" w:w="150"/>
+          <w:bottom w:type="dxa" w:w="90"/>
+          <w:right w:type="dxa" w:w="120"/>
+        </w:tblCellMar>
+      </w:tblPr>
+      <w:tblGrid>
+        <w:gridCol w:w="9026"/>
+      </w:tblGrid>
+      <w:tr>
+        <w:tc>
+          <w:tcPr>
+            <w:tcW w:type="dxa" w:w="9026"/>
+            <w:shd w:val="clear" w:color="auto" w:fill="FFF4D6"/>
+          </w:tcPr>
+          <w:p>
+            <w:pPr>
+              <w:spacing w:after="0" w:before="0" w:line="245"/>
+            </w:pPr>
+            <w:r>
+              <w:rPr>
+                <w:rFonts w:ascii="Calibri" w:cs="Calibri" w:eastAsia="Calibri" w:hAnsi="Calibri"/>
+                <w:b/>
+                <w:bCs/>
+                <w:color w:val="7A4B00"/>
+                <w:sz w:val="17"/>
+                <w:szCs w:val="17"/>
+              </w:rPr>
+              <w:t xml:space="preserve">DRAFT FOR REVIEW. Martabe work instruction 'Sampling Carbon Launder CIL' (DOC-3-MET-PRS-WIN-00058-IE, v1.0, issued 25/12/2024) added as Section 6 Part B. Not approved until reviewed. JSEA JSEA-PRO-MET-201-004 must be updated for the added hazard row.</w:t>
+            </w:r>
+          </w:p>
+        </w:tc>
+      </w:tr>
+    </w:tbl>
+    <w:p>
+      <w:pPr>
+        <w:spacing w:after="60" w:before="0" w:line="245"/>
+      </w:pPr>
+      <w:r>
+        <w:rPr>
+          <w:rFonts w:ascii="Calibri" w:cs="Calibri" w:eastAsia="Calibri" w:hAnsi="Calibri"/>
+          <w:sz w:val="17"/>
+          <w:szCs w:val="17"/>
+        </w:rPr>
+        <w:t xml:space="preserve"/>
+      </w:r>
     </w:p>
     <w:p>
       <w:pPr>
@@ -1756,6 +1810,58 @@
           </w:p>
         </w:tc>
       </w:tr>
+      <w:tr>
+        <w:tc>
+          <w:tcPr>
+            <w:tcW w:type="dxa" w:w="2900"/>
+            <w:shd w:val="clear" w:color="auto" w:fill="F2F5FA"/>
+            <w:tcMar>
+              <w:top w:type="dxa" w:w="55"/>
+              <w:left w:type="dxa" w:w="85"/>
+              <w:bottom w:type="dxa" w:w="55"/>
+              <w:right w:type="dxa" w:w="85"/>
+            </w:tcMar>
+          </w:tcPr>
+          <w:p>
+            <w:pPr>
+              <w:spacing w:after="0" w:line="235"/>
+            </w:pPr>
+            <w:r>
+              <w:rPr>
+                <w:rFonts w:ascii="Calibri" w:cs="Calibri" w:eastAsia="Calibri" w:hAnsi="Calibri"/>
+                <w:sz w:val="16"/>
+                <w:szCs w:val="16"/>
+              </w:rPr>
+              <w:t xml:space="preserve">[JSEA to confirm] The sampler striking the head, and a pinch point at the sampling point cover</w:t>
+            </w:r>
+          </w:p>
+        </w:tc>
+        <w:tc>
+          <w:tcPr>
+            <w:tcW w:type="dxa" w:w="6126"/>
+            <w:shd w:val="clear" w:color="auto" w:fill="F2F5FA"/>
+            <w:tcMar>
+              <w:top w:type="dxa" w:w="55"/>
+              <w:left w:type="dxa" w:w="85"/>
+              <w:bottom w:type="dxa" w:w="55"/>
+              <w:right w:type="dxa" w:w="85"/>
+            </w:tcMar>
+          </w:tcPr>
+          <w:p>
+            <w:pPr>
+              <w:spacing w:after="0" w:line="235"/>
+            </w:pPr>
+            <w:r>
+              <w:rPr>
+                <w:rFonts w:ascii="Calibri" w:cs="Calibri" w:eastAsia="Calibri" w:hAnsi="Calibri"/>
+                <w:sz w:val="16"/>
+                <w:szCs w:val="16"/>
+              </w:rPr>
+              <w:t xml:space="preserve">Hard hat on and the position of the sampler watched at all times. Open and close the cover slowly with hands clear of the pinch point and a safe distance kept. Slurry poured slowly. Glasses, latex gloves and safety boots; HCN controls as above.</w:t>
+            </w:r>
+          </w:p>
+        </w:tc>
+      </w:tr>
     </w:tbl>
     <w:p>
       <w:pPr>
@@ -2379,6 +2485,24 @@
     </w:p>
     <w:p>
       <w:pPr>
+        <w:pStyle w:val="ListParagraph"/>
+        <w:numPr>
+          <w:ilvl w:val="0"/>
+          <w:numId w:val="1"/>
+        </w:numPr>
+        <w:spacing w:after="60" w:line="245"/>
+      </w:pPr>
+      <w:r>
+        <w:rPr>
+          <w:rFonts w:ascii="Calibri" w:cs="Calibri" w:eastAsia="Calibri" w:hAnsi="Calibri"/>
+          <w:sz w:val="17"/>
+          <w:szCs w:val="17"/>
+        </w:rPr>
+        <w:t xml:space="preserve">[M] Carbon strainer, drying oven, tray, digital balance</w:t>
+      </w:r>
+    </w:p>
+    <w:p>
+      <w:pPr>
         <w:pStyle w:val="Heading1"/>
         <w:spacing w:after="120" w:before="260"/>
       </w:pPr>
@@ -2396,6 +2520,23 @@
     </w:p>
     <w:p>
       <w:pPr>
+        <w:spacing w:after="90" w:before="180" w:line="245"/>
+        <w:keepNext/>
+      </w:pPr>
+      <w:r>
+        <w:rPr>
+          <w:rFonts w:ascii="Calibri" w:cs="Calibri" w:eastAsia="Calibri" w:hAnsi="Calibri"/>
+          <w:b/>
+          <w:bCs/>
+          <w:color w:val="1F3864"/>
+          <w:sz w:val="19"/>
+          <w:szCs w:val="19"/>
+        </w:rPr>
+        <w:t xml:space="preserve">Part A - CIL launder solution profile</w:t>
+      </w:r>
+    </w:p>
+    <w:p>
+      <w:pPr>
         <w:ind w:left="280"/>
         <w:spacing w:after="50" w:before="0" w:line="245"/>
       </w:pPr>
@@ -2536,6 +2677,241 @@
           <w:szCs w:val="17"/>
         </w:rPr>
         <w:t xml:space="preserve">  Record all five results on one profile sheet so the trend down the train is visible on the page.</w:t>
+      </w:r>
+    </w:p>
+    <w:p>
+      <w:pPr>
+        <w:spacing w:after="90" w:before="180" w:line="245"/>
+        <w:keepNext/>
+      </w:pPr>
+      <w:r>
+        <w:rPr>
+          <w:rFonts w:ascii="Calibri" w:cs="Calibri" w:eastAsia="Calibri" w:hAnsi="Calibri"/>
+          <w:b/>
+          <w:bCs/>
+          <w:color w:val="1F3864"/>
+          <w:sz w:val="19"/>
+          <w:szCs w:val="19"/>
+        </w:rPr>
+        <w:t xml:space="preserve">Part B - Carbon in the CIL launder: sampling, drying and weighing [M]</w:t>
+      </w:r>
+    </w:p>
+    <w:p>
+      <w:pPr>
+        <w:spacing w:after="60" w:before="0" w:line="245"/>
+      </w:pPr>
+      <w:r>
+        <w:rPr>
+          <w:rFonts w:ascii="Calibri" w:cs="Calibri" w:eastAsia="Calibri" w:hAnsi="Calibri"/>
+          <w:sz w:val="17"/>
+          <w:szCs w:val="17"/>
+        </w:rPr>
+        <w:t xml:space="preserve">[M] = taken from the Martabe team work instruction "Sampling Carbon Launder CIL (DOC-3-MET-PRS-WIN-00058-IE)" (25/12/2024). [CONFIRM] = unspecified or inconsistent in the source; resolve before this instruction is approved for use. Part A (original steps) is unchanged.</w:t>
+      </w:r>
+    </w:p>
+    <w:p>
+      <w:pPr>
+        <w:spacing w:after="60" w:before="0" w:line="245"/>
+      </w:pPr>
+      <w:r>
+        <w:rPr>
+          <w:rFonts w:ascii="Calibri" w:cs="Calibri" w:eastAsia="Calibri" w:hAnsi="Calibri"/>
+          <w:sz w:val="17"/>
+          <w:szCs w:val="17"/>
+        </w:rPr>
+        <w:t xml:space="preserve">[CONFIRM] the source does not state its purpose; it is read as measuring the carbon carried to the launder, which shows carbon loss down the train. It also does not give the sampler volume, the oven temperature or the drying time (Martabe 'WI Mengoperasikan Oven FLSmidth', not received), so the concentration calculation is not set out here.</w:t>
+      </w:r>
+    </w:p>
+    <w:p>
+      <w:pPr>
+        <w:ind w:left="280"/>
+        <w:spacing w:after="50" w:before="0" w:line="245"/>
+      </w:pPr>
+      <w:r>
+        <w:rPr>
+          <w:rFonts w:ascii="Calibri" w:cs="Calibri" w:eastAsia="Calibri" w:hAnsi="Calibri"/>
+          <w:b/>
+          <w:bCs/>
+          <w:sz w:val="17"/>
+          <w:szCs w:val="17"/>
+        </w:rPr>
+        <w:t xml:space="preserve">7.</w:t>
+      </w:r>
+      <w:r>
+        <w:rPr>
+          <w:rFonts w:ascii="Calibri" w:cs="Calibri" w:eastAsia="Calibri" w:hAnsi="Calibri"/>
+          <w:sz w:val="17"/>
+          <w:szCs w:val="17"/>
+        </w:rPr>
+        <w:t xml:space="preserve">  Take 5 minutes before starting ('Take 5'). Prepare the sampler, carbon strainer and filter paper, and check they are in good condition [M].</w:t>
+      </w:r>
+    </w:p>
+    <w:p>
+      <w:pPr>
+        <w:ind w:left="280"/>
+        <w:spacing w:after="50" w:before="0" w:line="245"/>
+      </w:pPr>
+      <w:r>
+        <w:rPr>
+          <w:rFonts w:ascii="Calibri" w:cs="Calibri" w:eastAsia="Calibri" w:hAnsi="Calibri"/>
+          <w:b/>
+          <w:bCs/>
+          <w:sz w:val="17"/>
+          <w:szCs w:val="17"/>
+        </w:rPr>
+        <w:t xml:space="preserve">8.</w:t>
+      </w:r>
+      <w:r>
+        <w:rPr>
+          <w:rFonts w:ascii="Calibri" w:cs="Calibri" w:eastAsia="Calibri" w:hAnsi="Calibri"/>
+          <w:sz w:val="17"/>
+          <w:szCs w:val="17"/>
+        </w:rPr>
+        <w:t xml:space="preserve">  Take the sampler and strainer. Open the sampling point cover carefully.</w:t>
+      </w:r>
+    </w:p>
+    <w:p>
+      <w:pPr>
+        <w:ind w:left="280"/>
+        <w:spacing w:after="50" w:before="0" w:line="245"/>
+      </w:pPr>
+      <w:r>
+        <w:rPr>
+          <w:rFonts w:ascii="Calibri" w:cs="Calibri" w:eastAsia="Calibri" w:hAnsi="Calibri"/>
+          <w:b/>
+          <w:bCs/>
+          <w:sz w:val="17"/>
+          <w:szCs w:val="17"/>
+        </w:rPr>
+        <w:t xml:space="preserve">9.</w:t>
+      </w:r>
+      <w:r>
+        <w:rPr>
+          <w:rFonts w:ascii="Calibri" w:cs="Calibri" w:eastAsia="Calibri" w:hAnsi="Calibri"/>
+          <w:sz w:val="17"/>
+          <w:szCs w:val="17"/>
+        </w:rPr>
+        <w:t xml:space="preserve">  Put the sampler into the slurry and fill it. Pour the slurry onto the strainer. Do this 5 times.</w:t>
+      </w:r>
+    </w:p>
+    <w:p>
+      <w:pPr>
+        <w:ind w:left="280"/>
+        <w:spacing w:after="50" w:before="0" w:line="245"/>
+      </w:pPr>
+      <w:r>
+        <w:rPr>
+          <w:rFonts w:ascii="Calibri" w:cs="Calibri" w:eastAsia="Calibri" w:hAnsi="Calibri"/>
+          <w:b/>
+          <w:bCs/>
+          <w:sz w:val="17"/>
+          <w:szCs w:val="17"/>
+        </w:rPr>
+        <w:t xml:space="preserve">10.</w:t>
+      </w:r>
+      <w:r>
+        <w:rPr>
+          <w:rFonts w:ascii="Calibri" w:cs="Calibri" w:eastAsia="Calibri" w:hAnsi="Calibri"/>
+          <w:sz w:val="17"/>
+          <w:szCs w:val="17"/>
+        </w:rPr>
+        <w:t xml:space="preserve">  Close the sampling point cover tightly.</w:t>
+      </w:r>
+    </w:p>
+    <w:p>
+      <w:pPr>
+        <w:ind w:left="280"/>
+        <w:spacing w:after="50" w:before="0" w:line="245"/>
+      </w:pPr>
+      <w:r>
+        <w:rPr>
+          <w:rFonts w:ascii="Calibri" w:cs="Calibri" w:eastAsia="Calibri" w:hAnsi="Calibri"/>
+          <w:b/>
+          <w:bCs/>
+          <w:sz w:val="17"/>
+          <w:szCs w:val="17"/>
+        </w:rPr>
+        <w:t xml:space="preserve">11.</w:t>
+      </w:r>
+      <w:r>
+        <w:rPr>
+          <w:rFonts w:ascii="Calibri" w:cs="Calibri" w:eastAsia="Calibri" w:hAnsi="Calibri"/>
+          <w:sz w:val="17"/>
+          <w:szCs w:val="17"/>
+        </w:rPr>
+        <w:t xml:space="preserve">  Wash the slurry off the carbon on the strainer with tap water.</w:t>
+      </w:r>
+    </w:p>
+    <w:p>
+      <w:pPr>
+        <w:ind w:left="280"/>
+        <w:spacing w:after="50" w:before="0" w:line="245"/>
+      </w:pPr>
+      <w:r>
+        <w:rPr>
+          <w:rFonts w:ascii="Calibri" w:cs="Calibri" w:eastAsia="Calibri" w:hAnsi="Calibri"/>
+          <w:b/>
+          <w:bCs/>
+          <w:sz w:val="17"/>
+          <w:szCs w:val="17"/>
+        </w:rPr>
+        <w:t xml:space="preserve">12.</w:t>
+      </w:r>
+      <w:r>
+        <w:rPr>
+          <w:rFonts w:ascii="Calibri" w:cs="Calibri" w:eastAsia="Calibri" w:hAnsi="Calibri"/>
+          <w:sz w:val="17"/>
+          <w:szCs w:val="17"/>
+        </w:rPr>
+        <w:t xml:space="preserve">  Put the washed carbon on filter paper, roll the paper and put it on a tray. Put the tray in the oven on the lowest shelf to avoid contamination.</w:t>
+      </w:r>
+    </w:p>
+    <w:p>
+      <w:pPr>
+        <w:ind w:left="280"/>
+        <w:spacing w:after="50" w:before="0" w:line="245"/>
+      </w:pPr>
+      <w:r>
+        <w:rPr>
+          <w:rFonts w:ascii="Calibri" w:cs="Calibri" w:eastAsia="Calibri" w:hAnsi="Calibri"/>
+          <w:b/>
+          <w:bCs/>
+          <w:sz w:val="17"/>
+          <w:szCs w:val="17"/>
+        </w:rPr>
+        <w:t xml:space="preserve">13.</w:t>
+      </w:r>
+      <w:r>
+        <w:rPr>
+          <w:rFonts w:ascii="Calibri" w:cs="Calibri" w:eastAsia="Calibri" w:hAnsi="Calibri"/>
+          <w:sz w:val="17"/>
+          <w:szCs w:val="17"/>
+        </w:rPr>
+        <w:t xml:space="preserve">  Take the carbon out of the oven, weigh it on the digital balance and record the weight.</w:t>
+      </w:r>
+    </w:p>
+    <w:p>
+      <w:pPr>
+        <w:ind w:left="280"/>
+        <w:spacing w:after="50" w:before="0" w:line="245"/>
+      </w:pPr>
+      <w:r>
+        <w:rPr>
+          <w:rFonts w:ascii="Calibri" w:cs="Calibri" w:eastAsia="Calibri" w:hAnsi="Calibri"/>
+          <w:b/>
+          <w:bCs/>
+          <w:sz w:val="17"/>
+          <w:szCs w:val="17"/>
+        </w:rPr>
+        <w:t xml:space="preserve">14.</w:t>
+      </w:r>
+      <w:r>
+        <w:rPr>
+          <w:rFonts w:ascii="Calibri" w:cs="Calibri" w:eastAsia="Calibri" w:hAnsi="Calibri"/>
+          <w:sz w:val="17"/>
+          <w:szCs w:val="17"/>
+        </w:rPr>
+        <w:t xml:space="preserve">  Enter the weight and the carbon concentration on the form 'G:\Processing\5. Metallurgy\Metallurgy Lab\04 Metlab Data\Carbon\Carbon From Launder'.</w:t>
       </w:r>
     </w:p>
     <w:p>
@@ -2803,6 +3179,24 @@
           <w:szCs w:val="17"/>
         </w:rPr>
         <w:t xml:space="preserve">HM-PRC-V01-PRO005 Carbon in Leach (CIL) Circuit</w:t>
+      </w:r>
+    </w:p>
+    <w:p>
+      <w:pPr>
+        <w:pStyle w:val="ListParagraph"/>
+        <w:numPr>
+          <w:ilvl w:val="0"/>
+          <w:numId w:val="1"/>
+        </w:numPr>
+        <w:spacing w:after="60" w:line="245"/>
+      </w:pPr>
+      <w:r>
+        <w:rPr>
+          <w:rFonts w:ascii="Calibri" w:cs="Calibri" w:eastAsia="Calibri" w:hAnsi="Calibri"/>
+          <w:sz w:val="17"/>
+          <w:szCs w:val="17"/>
+        </w:rPr>
+        <w:t xml:space="preserve">Martabe work instruction 'Sampling Carbon Launder CIL' DOC-3-MET-PRS-WIN-00058-IE v1.0 (issued 25/12/2024; reference SOPs DOC-2-MET-PRM-SOP-00037-IE and DOC-2-MET-MEL-SOP-00087-IE) - Part B source</w:t>
       </w:r>
     </w:p>
     <w:sectPr>

</xml_diff>